<commit_message>
Correct verification procedure to match real UI: model/agent select + Журнал LLM-сессий
Replaces the earlier generic "read the chat response" procedure with the
actual workflow: select model (ollama ext variant) and agent, send the
document, then verify via Рабочее место ИБ → Журнал LLM-сессий (PII-span
summary, Оригинал/Анонимизировано comparison, Маппинги table) rather than
the chat reply. Adds two problem categories observed in a real test run
(false-positive PERSON span, truncated span on passport issuing
authority).
</commit_message>
<xml_diff>
--- a/docs/analysis/case-03-instrukciya-proverka-maskirovaniya.docx
+++ b/docs/analysis/case-03-instrukciya-proverka-maskirovaniya.docx
@@ -33,7 +33,18 @@
         <w:spacing w:after="140"/>
       </w:pPr>
       <w:r>
-        <w:t xml:space="preserve">Вы загружаете тестовый документ в чат (тот же интерфейс, где обычно работаете с платформой) и проверяете: система должна </w:t>
+        <w:t xml:space="preserve">Вы загружаете тестовый документ в чат платформы (</w:t>
+      </w:r>
+      <w:r>
+        <w:rPr>
+          <w:rFonts w:ascii="Consolas" w:cs="Consolas" w:eastAsia="Consolas" w:hAnsi="Consolas"/>
+          <w:sz w:val="20"/>
+          <w:szCs w:val="20"/>
+        </w:rPr>
+        <w:t xml:space="preserve">aiplatform.iqi.internal/shell/chat</w:t>
+      </w:r>
+      <w:r>
+        <w:t xml:space="preserve">) и проверяете: система должна </w:t>
       </w:r>
       <w:r>
         <w:rPr>
@@ -65,31 +76,41 @@
         <w:t xml:space="preserve">[INN_1]</w:t>
       </w:r>
       <w:r>
-        <w:t xml:space="preserve">) ещё до того, как что-либо уходит в облачную модель, а затем </w:t>
+        <w:t xml:space="preserve">) ещё до того, как что-либо уходит в модель. Проверка того, что именно и как замаскировалось, делается </w:t>
       </w:r>
       <w:r>
         <w:rPr>
           <w:b/>
           <w:bCs/>
         </w:rPr>
-        <w:t xml:space="preserve">вернуть их обратно</w:t>
-      </w:r>
-      <w:r>
-        <w:t xml:space="preserve"> в финальном ответе, который видите вы.</w:t>
-      </w:r>
-    </w:p>
-    <w:p>
-      <w:pPr>
-        <w:spacing w:after="140"/>
-      </w:pPr>
-      <w:r>
-        <w:t xml:space="preserve">Данные во всех тестовых документах — </w:t>
+        <w:t xml:space="preserve">не по ответу чата</w:t>
+      </w:r>
+      <w:r>
+        <w:t xml:space="preserve">, а отдельно — в </w:t>
       </w:r>
       <w:r>
         <w:rPr>
           <w:b/>
           <w:bCs/>
         </w:rPr>
+        <w:t xml:space="preserve">«Журнале LLM-сессий»</w:t>
+      </w:r>
+      <w:r>
+        <w:t xml:space="preserve"> (раздел ИБ), где по каждой сессии видно и оригинал, и анонимизированную версию, и построчную расшифровку меток.</w:t>
+      </w:r>
+    </w:p>
+    <w:p>
+      <w:pPr>
+        <w:spacing w:after="140"/>
+      </w:pPr>
+      <w:r>
+        <w:t xml:space="preserve">Данные во всех тестовых документах — </w:t>
+      </w:r>
+      <w:r>
+        <w:rPr>
+          <w:b/>
+          <w:bCs/>
+        </w:rPr>
         <w:t xml:space="preserve">синтетические</w:t>
       </w:r>
       <w:r>
@@ -164,6 +185,15 @@
       </w:pPr>
       <w:r>
         <w:t xml:space="preserve">3. Пошаговая процедура на каждый документ</w:t>
+      </w:r>
+    </w:p>
+    <w:p>
+      <w:pPr>
+        <w:pStyle w:val="Heading2"/>
+        <w:spacing w:after="120" w:before="220"/>
+      </w:pPr>
+      <w:r>
+        <w:t xml:space="preserve">А. Отправить документ</w:t>
       </w:r>
     </w:p>
     <w:p>
@@ -176,7 +206,7 @@
         <w:spacing w:after="120"/>
       </w:pPr>
       <w:r>
-        <w:t xml:space="preserve">Откройте чат платформы.</w:t>
+        <w:t xml:space="preserve">Откройте платформу и нажмите «+ Новый чат».</w:t>
       </w:r>
     </w:p>
     <w:p>
@@ -189,7 +219,39 @@
         <w:spacing w:after="120"/>
       </w:pPr>
       <w:r>
-        <w:t xml:space="preserve">Прикрепите один тестовый файл.</w:t>
+        <w:t xml:space="preserve">В поле </w:t>
+      </w:r>
+      <w:r>
+        <w:rPr>
+          <w:b/>
+          <w:bCs/>
+        </w:rPr>
+        <w:t xml:space="preserve">МОДЕЛЬ</w:t>
+      </w:r>
+      <w:r>
+        <w:t xml:space="preserve"> выберите модель с пометкой </w:t>
+      </w:r>
+      <w:r>
+        <w:rPr>
+          <w:rFonts w:ascii="Consolas" w:cs="Consolas" w:eastAsia="Consolas" w:hAnsi="Consolas"/>
+          <w:sz w:val="20"/>
+          <w:szCs w:val="20"/>
+        </w:rPr>
+        <w:t xml:space="preserve">ollama ext</w:t>
+      </w:r>
+      <w:r>
+        <w:t xml:space="preserve"> (например </w:t>
+      </w:r>
+      <w:r>
+        <w:rPr>
+          <w:rFonts w:ascii="Consolas" w:cs="Consolas" w:eastAsia="Consolas" w:hAnsi="Consolas"/>
+          <w:sz w:val="20"/>
+          <w:szCs w:val="20"/>
+        </w:rPr>
+        <w:t xml:space="preserve">qwen3.5:35b · ollama ext</w:t>
+      </w:r>
+      <w:r>
+        <w:t xml:space="preserve">) — именно она используется в проверке маскирования.</w:t>
       </w:r>
     </w:p>
     <w:p>
@@ -202,27 +264,17 @@
         <w:spacing w:after="120"/>
       </w:pPr>
       <w:r>
-        <w:t xml:space="preserve">Отправьте простой запрос, например: </w:t>
+        <w:t xml:space="preserve">В поле </w:t>
       </w:r>
       <w:r>
         <w:rPr>
           <w:b/>
           <w:bCs/>
         </w:rPr>
-        <w:t xml:space="preserve">«Перечисли все данные из документа»</w:t>
-      </w:r>
-      <w:r>
-        <w:t xml:space="preserve"> или </w:t>
-      </w:r>
-      <w:r>
-        <w:rPr>
-          <w:b/>
-          <w:bCs/>
-        </w:rPr>
-        <w:t xml:space="preserve">«Опиши содержимое документа»</w:t>
-      </w:r>
-      <w:r>
-        <w:t xml:space="preserve">. Не нужно ничего специального формулировать — задача модели не в этом, задача — проверить, что вернётся в ответе.</w:t>
+        <w:t xml:space="preserve">АГЕНТ</w:t>
+      </w:r>
+      <w:r>
+        <w:t xml:space="preserve"> выберите нужного агента (например «Синапс.Инсайт — Closed-book RAG (системный)»).</w:t>
       </w:r>
     </w:p>
     <w:p>
@@ -235,7 +287,7 @@
         <w:spacing w:after="120"/>
       </w:pPr>
       <w:r>
-        <w:t xml:space="preserve">Дождитесь ответа. Если «Обдумывание» идёт заметно дольше обычного (по нашим замерам — свыше ~20 секунд, иногда доходило до 1–2 минут) — это отдельная известная проблема производительности бэкенда, не связанная с маскированием как таковым. Дождитесь ответа или тайм-аута, зафиксируйте время в комментарии к строке теста (см. п. 6).</w:t>
+        <w:t xml:space="preserve">Прикрепите один тестовый файл (значок скрепки внизу окна чата) и отправьте запрос — формулировка не важна, например «Опиши содержимое документа».</w:t>
       </w:r>
     </w:p>
     <w:p>
@@ -248,7 +300,262 @@
         <w:spacing w:after="120"/>
       </w:pPr>
       <w:r>
-        <w:t xml:space="preserve">Внимательно прочитайте ответ модели.</w:t>
+        <w:t xml:space="preserve">Дождитесь ответа. Если «Обдумывание» идёт заметно дольше обычного (по нашим замерам — свыше ~20 секунд, иногда доходило до 1–2 минут) — это отдельная известная проблема производительности бэкенда, не связанная с маскированием как таковым. Дождитесь ответа или тайм-аута, зафиксируйте время в комментарии к строке теста (см. п. 6).</w:t>
+      </w:r>
+    </w:p>
+    <w:p>
+      <w:pPr>
+        <w:pStyle w:val="Heading2"/>
+        <w:spacing w:after="120" w:before="220"/>
+      </w:pPr>
+      <w:r>
+        <w:t xml:space="preserve">Б. Проверить результат в Журнале LLM</w:t>
+      </w:r>
+    </w:p>
+    <w:p>
+      <w:pPr>
+        <w:pStyle w:val="ListParagraph"/>
+        <w:numPr>
+          <w:ilvl w:val="0"/>
+          <w:numId w:val="3"/>
+        </w:numPr>
+        <w:spacing w:after="120"/>
+      </w:pPr>
+      <w:r>
+        <w:t xml:space="preserve">В верхнем меню откройте </w:t>
+      </w:r>
+      <w:r>
+        <w:rPr>
+          <w:b/>
+          <w:bCs/>
+        </w:rPr>
+        <w:t xml:space="preserve">«Рабочее место ИБ» → «Журнал LLM-сессий»</w:t>
+      </w:r>
+      <w:r>
+        <w:t xml:space="preserve">.</w:t>
+      </w:r>
+    </w:p>
+    <w:p>
+      <w:pPr>
+        <w:pStyle w:val="ListParagraph"/>
+        <w:numPr>
+          <w:ilvl w:val="0"/>
+          <w:numId w:val="3"/>
+        </w:numPr>
+        <w:spacing w:after="120"/>
+      </w:pPr>
+      <w:r>
+        <w:t xml:space="preserve">Найдите свою сессию (по времени отправки или по названию чата) и откройте её.</w:t>
+      </w:r>
+    </w:p>
+    <w:p>
+      <w:pPr>
+        <w:pStyle w:val="ListParagraph"/>
+        <w:numPr>
+          <w:ilvl w:val="0"/>
+          <w:numId w:val="3"/>
+        </w:numPr>
+        <w:spacing w:after="120"/>
+      </w:pPr>
+      <w:r>
+        <w:t xml:space="preserve">Наверху страницы сессии — сводка: </w:t>
+      </w:r>
+      <w:r>
+        <w:rPr>
+          <w:b/>
+          <w:bCs/>
+        </w:rPr>
+        <w:t xml:space="preserve">«Всего PII-spans»</w:t>
+      </w:r>
+      <w:r>
+        <w:t xml:space="preserve"> (общее число найденных сущностей) и разбивка по типам с количеством, например </w:t>
+      </w:r>
+      <w:r>
+        <w:rPr>
+          <w:rFonts w:ascii="Consolas" w:cs="Consolas" w:eastAsia="Consolas" w:hAnsi="Consolas"/>
+          <w:sz w:val="20"/>
+          <w:szCs w:val="20"/>
+        </w:rPr>
+        <w:t xml:space="preserve">EMAIL: 1</w:t>
+      </w:r>
+      <w:r>
+        <w:t xml:space="preserve">, </w:t>
+      </w:r>
+      <w:r>
+        <w:rPr>
+          <w:rFonts w:ascii="Consolas" w:cs="Consolas" w:eastAsia="Consolas" w:hAnsi="Consolas"/>
+          <w:sz w:val="20"/>
+          <w:szCs w:val="20"/>
+        </w:rPr>
+        <w:t xml:space="preserve">INN: 1</w:t>
+      </w:r>
+      <w:r>
+        <w:t xml:space="preserve">, </w:t>
+      </w:r>
+      <w:r>
+        <w:rPr>
+          <w:rFonts w:ascii="Consolas" w:cs="Consolas" w:eastAsia="Consolas" w:hAnsi="Consolas"/>
+          <w:sz w:val="20"/>
+          <w:szCs w:val="20"/>
+        </w:rPr>
+        <w:t xml:space="preserve">SNILS: 1</w:t>
+      </w:r>
+      <w:r>
+        <w:t xml:space="preserve">, </w:t>
+      </w:r>
+      <w:r>
+        <w:rPr>
+          <w:rFonts w:ascii="Consolas" w:cs="Consolas" w:eastAsia="Consolas" w:hAnsi="Consolas"/>
+          <w:sz w:val="20"/>
+          <w:szCs w:val="20"/>
+        </w:rPr>
+        <w:t xml:space="preserve">PHONE: 1</w:t>
+      </w:r>
+      <w:r>
+        <w:t xml:space="preserve">, </w:t>
+      </w:r>
+      <w:r>
+        <w:rPr>
+          <w:rFonts w:ascii="Consolas" w:cs="Consolas" w:eastAsia="Consolas" w:hAnsi="Consolas"/>
+          <w:sz w:val="20"/>
+          <w:szCs w:val="20"/>
+        </w:rPr>
+        <w:t xml:space="preserve">FULL_NAME: 1</w:t>
+      </w:r>
+      <w:r>
+        <w:t xml:space="preserve">, </w:t>
+      </w:r>
+      <w:r>
+        <w:rPr>
+          <w:rFonts w:ascii="Consolas" w:cs="Consolas" w:eastAsia="Consolas" w:hAnsi="Consolas"/>
+          <w:sz w:val="20"/>
+          <w:szCs w:val="20"/>
+        </w:rPr>
+        <w:t xml:space="preserve">PASSPORT: 1</w:t>
+      </w:r>
+      <w:r>
+        <w:t xml:space="preserve">, </w:t>
+      </w:r>
+      <w:r>
+        <w:rPr>
+          <w:rFonts w:ascii="Consolas" w:cs="Consolas" w:eastAsia="Consolas" w:hAnsi="Consolas"/>
+          <w:sz w:val="20"/>
+          <w:szCs w:val="20"/>
+        </w:rPr>
+        <w:t xml:space="preserve">DOB: 1</w:t>
+      </w:r>
+      <w:r>
+        <w:t xml:space="preserve">, </w:t>
+      </w:r>
+      <w:r>
+        <w:rPr>
+          <w:rFonts w:ascii="Consolas" w:cs="Consolas" w:eastAsia="Consolas" w:hAnsi="Consolas"/>
+          <w:sz w:val="20"/>
+          <w:szCs w:val="20"/>
+        </w:rPr>
+        <w:t xml:space="preserve">PERSON: 1</w:t>
+      </w:r>
+      <w:r>
+        <w:t xml:space="preserve">, </w:t>
+      </w:r>
+      <w:r>
+        <w:rPr>
+          <w:rFonts w:ascii="Consolas" w:cs="Consolas" w:eastAsia="Consolas" w:hAnsi="Consolas"/>
+          <w:sz w:val="20"/>
+          <w:szCs w:val="20"/>
+        </w:rPr>
+        <w:t xml:space="preserve">ADDRESS: 2</w:t>
+      </w:r>
+      <w:r>
+        <w:t xml:space="preserve">.</w:t>
+      </w:r>
+    </w:p>
+    <w:p>
+      <w:pPr>
+        <w:pStyle w:val="ListParagraph"/>
+        <w:numPr>
+          <w:ilvl w:val="0"/>
+          <w:numId w:val="3"/>
+        </w:numPr>
+        <w:spacing w:after="120"/>
+      </w:pPr>
+      <w:r>
+        <w:t xml:space="preserve">Ниже, в блоке </w:t>
+      </w:r>
+      <w:r>
+        <w:rPr>
+          <w:b/>
+          <w:bCs/>
+        </w:rPr>
+        <w:t xml:space="preserve">Turns</w:t>
+      </w:r>
+      <w:r>
+        <w:t xml:space="preserve">, открывается сам запрос в двух колонках: </w:t>
+      </w:r>
+      <w:r>
+        <w:rPr>
+          <w:b/>
+          <w:bCs/>
+        </w:rPr>
+        <w:t xml:space="preserve">«Оригинал»</w:t>
+      </w:r>
+      <w:r>
+        <w:t xml:space="preserve"> (розовый фон — что реально было в документе) и </w:t>
+      </w:r>
+      <w:r>
+        <w:rPr>
+          <w:b/>
+          <w:bCs/>
+        </w:rPr>
+        <w:t xml:space="preserve">«Анонимизировано»</w:t>
+      </w:r>
+      <w:r>
+        <w:t xml:space="preserve"> (зелёный фон — что реально ушло в модель, с метками вместо значений). Сравните их визуально.</w:t>
+      </w:r>
+    </w:p>
+    <w:p>
+      <w:pPr>
+        <w:pStyle w:val="ListParagraph"/>
+        <w:numPr>
+          <w:ilvl w:val="0"/>
+          <w:numId w:val="3"/>
+        </w:numPr>
+        <w:spacing w:after="120"/>
+      </w:pPr>
+      <w:r>
+        <w:t xml:space="preserve">Ещё ниже — </w:t>
+      </w:r>
+      <w:r>
+        <w:rPr>
+          <w:b/>
+          <w:bCs/>
+        </w:rPr>
+        <w:t xml:space="preserve">«Маппинги»</w:t>
+      </w:r>
+      <w:r>
+        <w:t xml:space="preserve">: построчный список каждой метки и что она реально означает, например: </w:t>
+      </w:r>
+      <w:r>
+        <w:rPr>
+          <w:rFonts w:ascii="Consolas" w:cs="Consolas" w:eastAsia="Consolas" w:hAnsi="Consolas"/>
+          <w:sz w:val="20"/>
+          <w:szCs w:val="20"/>
+        </w:rPr>
+        <w:t xml:space="preserve">[INN_1] → 860300663070 (INN)</w:t>
+      </w:r>
+      <w:r>
+        <w:t xml:space="preserve">, </w:t>
+      </w:r>
+      <w:r>
+        <w:rPr>
+          <w:rFonts w:ascii="Consolas" w:cs="Consolas" w:eastAsia="Consolas" w:hAnsi="Consolas"/>
+          <w:sz w:val="20"/>
+          <w:szCs w:val="20"/>
+        </w:rPr>
+        <w:t xml:space="preserve">[PHONE_1] → +7 916 123-45-67 (PHONE)</w:t>
+      </w:r>
+      <w:r>
+        <w:t xml:space="preserve">. Это самый точный способ проверки — по маппингам видно и что нашли, и как классифицировали, и правильно ли.</w:t>
       </w:r>
     </w:p>
     <w:p>
@@ -265,7 +572,7 @@
         <w:spacing w:after="140"/>
       </w:pPr>
       <w:r>
-        <w:t xml:space="preserve">В ответе </w:t>
+        <w:t xml:space="preserve">В колонке «Анонимизировано» Журнала LLM </w:t>
       </w:r>
       <w:r>
         <w:rPr>
@@ -286,7 +593,18 @@
         <w:t xml:space="preserve">[КОД_N]</w:t>
       </w:r>
       <w:r>
-        <w:t xml:space="preserve">. Ниже — полный список всех 20 встроенных типов, которые платформа умеет распознавать и маскировать (не только те, что есть в наших тестовых документах — пригодится и при проверке на любых других файлах):</w:t>
+        <w:t xml:space="preserve">. В «Маппингах» каждая метка должна вести к правильному реальному значению правильного типа, а число «Всего PII-spans» должно примерно совпадать с числом сущностей в документе (ориентир — </w:t>
+      </w:r>
+      <w:r>
+        <w:rPr>
+          <w:rFonts w:ascii="Consolas" w:cs="Consolas" w:eastAsia="Consolas" w:hAnsi="Consolas"/>
+          <w:sz w:val="20"/>
+          <w:szCs w:val="20"/>
+        </w:rPr>
+        <w:t xml:space="preserve">manifest.json</w:t>
+      </w:r>
+      <w:r>
+        <w:t xml:space="preserve"> в папке с тестовыми документами). Ниже — полный список всех 20 встроенных типов, которые платформа умеет распознавать и маскировать (не только те, что есть в наших тестовых документах — пригодится и при проверке на любых других файлах):</w:t>
       </w:r>
     </w:p>
     <w:tbl>
@@ -1385,7 +1703,7 @@
         <w:spacing w:after="120"/>
       </w:pPr>
       <w:r>
-        <w:t xml:space="preserve">В ответе видно настоящее значение из списка в таблице выше (ФИО, ИНН, СНИЛС, телефон, email, адрес, паспорт, номер счёта, номер карты) — не заменённое на метку.</w:t>
+        <w:t xml:space="preserve">В колонке «Анонимизировано» видно настоящее значение из списка в таблице выше (ФИО, ИНН, СНИЛС, телефон, email, адрес, паспорт, номер счёта, номер карты) — не заменённое на метку.</w:t>
       </w:r>
     </w:p>
     <w:p>
@@ -1398,7 +1716,58 @@
         <w:spacing w:after="120"/>
       </w:pPr>
       <w:r>
-        <w:t xml:space="preserve">Метка стоит не на своём месте или перепутана между разными людьми (особенно проверяйте это на «Реестре операций» — там 5 разных клиентов, и важно, что данные одного не подставились вместо данных другого).</w:t>
+        <w:t xml:space="preserve">В «Маппингах» метка ведёт не к тому значению, или перепутана между разными людьми (особенно проверяйте это на «Реестре операций» — там 5 разных клиентов, и важно, что данные одного не подставились вместо данных другого).</w:t>
+      </w:r>
+    </w:p>
+    <w:p>
+      <w:pPr>
+        <w:pStyle w:val="ListParagraph"/>
+        <w:numPr>
+          <w:ilvl w:val="0"/>
+          <w:numId w:val="1"/>
+        </w:numPr>
+        <w:spacing w:after="120"/>
+      </w:pPr>
+      <w:r>
+        <w:rPr>
+          <w:b/>
+          <w:bCs/>
+        </w:rPr>
+        <w:t xml:space="preserve">Ложное срабатывание</w:t>
+      </w:r>
+      <w:r>
+        <w:t xml:space="preserve"> — метка стоит там, где на самом деле никакого ПДн нет (например, кусок служебного текста или инструкции ошибочно распознан как </w:t>
+      </w:r>
+      <w:r>
+        <w:rPr>
+          <w:rFonts w:ascii="Consolas" w:cs="Consolas" w:eastAsia="Consolas" w:hAnsi="Consolas"/>
+          <w:sz w:val="20"/>
+          <w:szCs w:val="20"/>
+        </w:rPr>
+        <w:t xml:space="preserve">PERSON</w:t>
+      </w:r>
+      <w:r>
+        <w:t xml:space="preserve">). Такое уже встречалось на практике.</w:t>
+      </w:r>
+    </w:p>
+    <w:p>
+      <w:pPr>
+        <w:pStyle w:val="ListParagraph"/>
+        <w:numPr>
+          <w:ilvl w:val="0"/>
+          <w:numId w:val="1"/>
+        </w:numPr>
+        <w:spacing w:after="120"/>
+      </w:pPr>
+      <w:r>
+        <w:rPr>
+          <w:b/>
+          <w:bCs/>
+        </w:rPr>
+        <w:t xml:space="preserve">Обрезанный/неполный спан</w:t>
+      </w:r>
+      <w:r>
+        <w:t xml:space="preserve"> — в метку попал только фрагмент значения, а не всё целиком. Тоже встречалось на практике — на «Месте выдачи паспорта» замаскировалась только часть фразы, а не весь текст.</w:t>
       </w:r>
     </w:p>
     <w:p>
@@ -1645,6 +2014,18 @@
       </w:pPr>
     </w:lvl>
   </w:abstractNum>
+  <w:abstractNum w:abstractNumId="3" w15:restartNumberingAfterBreak="0">
+    <w:multiLevelType w:val="hybridMultilevel"/>
+    <w:lvl w:ilvl="0" w15:tentative="1">
+      <w:start w:val="1"/>
+      <w:numFmt w:val="decimal"/>
+      <w:lvlText w:val="%1."/>
+      <w:lvlJc w:val="start"/>
+      <w:pPr>
+        <w:ind w:left="450" w:hanging="260"/>
+      </w:pPr>
+    </w:lvl>
+  </w:abstractNum>
   <w:num w:numId="1">
     <w:abstractNumId w:val="1"/>
     <w:lvlOverride w:ilvl="0">
@@ -1653,6 +2034,12 @@
   </w:num>
   <w:num w:numId="2">
     <w:abstractNumId w:val="2"/>
+    <w:lvlOverride w:ilvl="0">
+      <w:startOverride w:val="1"/>
+    </w:lvlOverride>
+  </w:num>
+  <w:num w:numId="3">
+    <w:abstractNumId w:val="3"/>
     <w:lvlOverride w:ilvl="0">
       <w:startOverride w:val="1"/>
     </w:lvlOverride>

</xml_diff>

<commit_message>
Generalize document source to any convenient channel, not a repo path
</commit_message>
<xml_diff>
--- a/docs/analysis/case-03-instrukciya-proverka-maskirovaniya.docx
+++ b/docs/analysis/case-03-instrukciya-proverka-maskirovaniya.docx
@@ -131,48 +131,34 @@
         <w:spacing w:after="140"/>
       </w:pPr>
       <w:r>
-        <w:t xml:space="preserve">Тестовые документы — в папке </w:t>
-      </w:r>
-      <w:r>
-        <w:rPr>
-          <w:rFonts w:ascii="Consolas" w:cs="Consolas" w:eastAsia="Consolas" w:hAnsi="Consolas"/>
-          <w:sz w:val="20"/>
-          <w:szCs w:val="20"/>
-        </w:rPr>
-        <w:t xml:space="preserve">docs/test-data/anonymizer-2-test-documents/</w:t>
-      </w:r>
-      <w:r>
-        <w:t xml:space="preserve"> (3 сюжета × 8 форматов = 24 файла): </w:t>
-      </w:r>
-      <w:r>
-        <w:rPr>
-          <w:rFonts w:ascii="Consolas" w:cs="Consolas" w:eastAsia="Consolas" w:hAnsi="Consolas"/>
-          <w:sz w:val="20"/>
-          <w:szCs w:val="20"/>
-        </w:rPr>
-        <w:t xml:space="preserve">01-anketa-klienta</w:t>
+        <w:t xml:space="preserve">Возьмите тестовые документы из любого удобного источника, куда их вам предоставили организаторы теста. Всего 3 сюжета × 8 форматов = 24 файла: </w:t>
+      </w:r>
+      <w:r>
+        <w:rPr>
+          <w:b/>
+          <w:bCs/>
+        </w:rPr>
+        <w:t xml:space="preserve">анкета клиента</w:t>
       </w:r>
       <w:r>
         <w:t xml:space="preserve">, </w:t>
       </w:r>
       <w:r>
         <w:rPr>
-          <w:rFonts w:ascii="Consolas" w:cs="Consolas" w:eastAsia="Consolas" w:hAnsi="Consolas"/>
-          <w:sz w:val="20"/>
-          <w:szCs w:val="20"/>
-        </w:rPr>
-        <w:t xml:space="preserve">02-sluzhebnaya-zapiska</w:t>
+          <w:b/>
+          <w:bCs/>
+        </w:rPr>
+        <w:t xml:space="preserve">служебная записка</w:t>
       </w:r>
       <w:r>
         <w:t xml:space="preserve">, </w:t>
       </w:r>
       <w:r>
         <w:rPr>
-          <w:rFonts w:ascii="Consolas" w:cs="Consolas" w:eastAsia="Consolas" w:hAnsi="Consolas"/>
-          <w:sz w:val="20"/>
-          <w:szCs w:val="20"/>
-        </w:rPr>
-        <w:t xml:space="preserve">03-reestr-operaciy</w:t>
+          <w:b/>
+          <w:bCs/>
+        </w:rPr>
+        <w:t xml:space="preserve">реестр операций</w:t>
       </w:r>
       <w:r>
         <w:t xml:space="preserve">. Берите любой формат, который платформа должна поддерживать (txt, json, xml, xlsx, docx, pptx, pdf).</w:t>

</xml_diff>

<commit_message>
Fix instruction doc: real UI nav, mask example INN, trim sections
- Correct Журнал LLM-сессий navigation: it is reached via left-menu
  «Администрирование», not directly from a top nav bar, per real
  screenshots of the platform.
- Replace the real INN (860300663070) used in the worked example with
  a synthetic one already used in the test manifest (770912345678).
- Drop the leftover "24 files / 3 scenarios" enumeration from
  "Откуда взять документы" — now just points to any convenient source.
- Remove the "Куда записывать результат" section per request; renumber
  the closing section to "Если что-то пошло не так".
</commit_message>
<xml_diff>
--- a/docs/analysis/case-03-instrukciya-proverka-maskirovaniya.docx
+++ b/docs/analysis/case-03-instrukciya-proverka-maskirovaniya.docx
@@ -131,37 +131,7 @@
         <w:spacing w:after="140"/>
       </w:pPr>
       <w:r>
-        <w:t xml:space="preserve">Возьмите тестовые документы из любого удобного источника, куда их вам предоставили организаторы теста. Всего 3 сюжета × 8 форматов = 24 файла: </w:t>
-      </w:r>
-      <w:r>
-        <w:rPr>
-          <w:b/>
-          <w:bCs/>
-        </w:rPr>
-        <w:t xml:space="preserve">анкета клиента</w:t>
-      </w:r>
-      <w:r>
-        <w:t xml:space="preserve">, </w:t>
-      </w:r>
-      <w:r>
-        <w:rPr>
-          <w:b/>
-          <w:bCs/>
-        </w:rPr>
-        <w:t xml:space="preserve">служебная записка</w:t>
-      </w:r>
-      <w:r>
-        <w:t xml:space="preserve">, </w:t>
-      </w:r>
-      <w:r>
-        <w:rPr>
-          <w:b/>
-          <w:bCs/>
-        </w:rPr>
-        <w:t xml:space="preserve">реестр операций</w:t>
-      </w:r>
-      <w:r>
-        <w:t xml:space="preserve">. Берите любой формат, который платформа должна поддерживать (txt, json, xml, xlsx, docx, pptx, pdf).</w:t>
+        <w:t xml:space="preserve">Возьмите тестовые документы из любого удобного источника.</w:t>
       </w:r>
     </w:p>
     <w:p>
@@ -286,7 +256,7 @@
         <w:spacing w:after="120"/>
       </w:pPr>
       <w:r>
-        <w:t xml:space="preserve">Дождитесь ответа. Если «Обдумывание» идёт заметно дольше обычного (по нашим замерам — свыше ~20 секунд, иногда доходило до 1–2 минут) — это отдельная известная проблема производительности бэкенда, не связанная с маскированием как таковым. Дождитесь ответа или тайм-аута, зафиксируйте время в комментарии к строке теста (см. п. 6).</w:t>
+        <w:t xml:space="preserve">Дождитесь ответа. Если «Обдумывание» идёт заметно дольше обычного (по нашим замерам — свыше ~20 секунд, иногда доходило до 1–2 минут) — это отдельная известная проблема производительности бэкенда, не связанная с маскированием как таковым. Дождитесь ответа или тайм-аута, зафиксируйте время в комментарии к результату теста.</w:t>
       </w:r>
     </w:p>
     <w:p>
@@ -308,7 +278,17 @@
         <w:spacing w:after="120"/>
       </w:pPr>
       <w:r>
-        <w:t xml:space="preserve">В верхнем меню откройте </w:t>
+        <w:t xml:space="preserve">В левом меню платформы нажмите </w:t>
+      </w:r>
+      <w:r>
+        <w:rPr>
+          <w:b/>
+          <w:bCs/>
+        </w:rPr>
+        <w:t xml:space="preserve">«Администрирование»</w:t>
+      </w:r>
+      <w:r>
+        <w:t xml:space="preserve"> — откроется раздел с отдельным верхним меню. В нём выберите </w:t>
       </w:r>
       <w:r>
         <w:rPr>
@@ -527,7 +507,7 @@
           <w:sz w:val="20"/>
           <w:szCs w:val="20"/>
         </w:rPr>
-        <w:t xml:space="preserve">[INN_1] → 860300663070 (INN)</w:t>
+        <w:t xml:space="preserve">[INN_1] → 770912345678 (INN)</w:t>
       </w:r>
       <w:r>
         <w:t xml:space="preserve">, </w:t>
@@ -1775,35 +1755,7 @@
         <w:spacing w:after="140" w:before="280"/>
       </w:pPr>
       <w:r>
-        <w:t xml:space="preserve">6. Куда записывать результат</w:t>
-      </w:r>
-    </w:p>
-    <w:p>
-      <w:pPr>
-        <w:spacing w:after="140"/>
-      </w:pPr>
-      <w:r>
-        <w:t xml:space="preserve">Используйте </w:t>
-      </w:r>
-      <w:r>
-        <w:rPr>
-          <w:rFonts w:ascii="Consolas" w:cs="Consolas" w:eastAsia="Consolas" w:hAnsi="Consolas"/>
-          <w:sz w:val="20"/>
-          <w:szCs w:val="20"/>
-        </w:rPr>
-        <w:t xml:space="preserve">docs/test-data/anonymizer-2-test-documents/test-tracker.xlsx</w:t>
-      </w:r>
-      <w:r>
-        <w:t xml:space="preserve">, лист «Тест-лист»: по строке на каждый документ/формат — впишите, сколько сущностей распознано и замаскировано, была ли утечка (да/нет), корректно ли демаскирование в ответе, и комментарий (в т.ч. если ответ шёл необычно долго или упал с ошибкой). Лист «Сводка» сам посчитает % по каждому формату.</w:t>
-      </w:r>
-    </w:p>
-    <w:p>
-      <w:pPr>
-        <w:pStyle w:val="Heading1"/>
-        <w:spacing w:after="140" w:before="280"/>
-      </w:pPr>
-      <w:r>
-        <w:t xml:space="preserve">7. Если что-то пошло не так</w:t>
+        <w:t xml:space="preserve">6. Если что-то пошло не так</w:t>
       </w:r>
     </w:p>
     <w:p>

</xml_diff>

<commit_message>
Add test account credentials note to instruction doc
Testers log in with adm_user@d8.invest / adm_user1; password sent
separately.
</commit_message>
<xml_diff>
--- a/docs/analysis/case-03-instrukciya-proverka-maskirovaniya.docx
+++ b/docs/analysis/case-03-instrukciya-proverka-maskirovaniya.docx
@@ -141,6 +141,36 @@
       </w:pPr>
       <w:r>
         <w:t xml:space="preserve">3. Пошаговая процедура на каждый документ</w:t>
+      </w:r>
+    </w:p>
+    <w:p>
+      <w:pPr>
+        <w:spacing w:after="140"/>
+      </w:pPr>
+      <w:r>
+        <w:t xml:space="preserve">Тестирование проводится под учётной записью: email </w:t>
+      </w:r>
+      <w:r>
+        <w:rPr>
+          <w:rFonts w:ascii="Consolas" w:cs="Consolas" w:eastAsia="Consolas" w:hAnsi="Consolas"/>
+          <w:sz w:val="20"/>
+          <w:szCs w:val="20"/>
+        </w:rPr>
+        <w:t xml:space="preserve">adm_user@d8.invest</w:t>
+      </w:r>
+      <w:r>
+        <w:t xml:space="preserve">, имя </w:t>
+      </w:r>
+      <w:r>
+        <w:rPr>
+          <w:rFonts w:ascii="Consolas" w:cs="Consolas" w:eastAsia="Consolas" w:hAnsi="Consolas"/>
+          <w:sz w:val="20"/>
+          <w:szCs w:val="20"/>
+        </w:rPr>
+        <w:t xml:space="preserve">adm_user1</w:t>
+      </w:r>
+      <w:r>
+        <w:t xml:space="preserve">. Пароль будет выслан дополнительно.</w:t>
       </w:r>
     </w:p>
     <w:p>

</xml_diff>

<commit_message>
Remove contract-number PII caveat callout from instruction doc
</commit_message>
<xml_diff>
--- a/docs/analysis/case-03-instrukciya-proverka-maskirovaniya.docx
+++ b/docs/analysis/case-03-instrukciya-proverka-maskirovaniya.docx
@@ -1644,40 +1644,6 @@
       </w:pPr>
       <w:r>
         <w:t xml:space="preserve">В наших тестовых документах (anonymizer-2-test-documents) реально встречаются только 9 из этих 20 типов: ФИО, ИНН, СНИЛС, Телефон, Email, Адрес, Паспорт, Банковский счёт, Банковская карта — остальные 11 в тестовом наборе не проверяются, таблица дана как полный справочник на будущее.</w:t>
-      </w:r>
-    </w:p>
-    <w:p>
-      <w:pPr>
-        <w:pStyle w:val="Heading2"/>
-        <w:spacing w:after="120" w:before="220"/>
-      </w:pPr>
-      <w:r>
-        <w:t xml:space="preserve">Важная оговорка про номер договора</w:t>
-      </w:r>
-    </w:p>
-    <w:p>
-      <w:pPr>
-        <w:spacing w:after="140"/>
-      </w:pPr>
-      <w:r>
-        <w:rPr>
-          <w:b/>
-          <w:bCs/>
-        </w:rPr>
-        <w:t xml:space="preserve">Номер договора (например, ИКД-1-PRO-TEST-001) не входит во встроенные типы, которые платформа умеет распознавать по умолчанию.</w:t>
-      </w:r>
-      <w:r>
-        <w:t xml:space="preserve"> Если он остаётся в ответе в открытом виде — это </w:t>
-      </w:r>
-      <w:r>
-        <w:rPr>
-          <w:b/>
-          <w:bCs/>
-        </w:rPr>
-        <w:t xml:space="preserve">ожидаемое поведение</w:t>
-      </w:r>
-      <w:r>
-        <w:t xml:space="preserve">, а не найденная вами утечка или баг, если только вам заранее не подтвердили, что для номеров договоров специально настроен отдельный (кастомный) тип маскирования. Если сомневаетесь — зафиксируйте в комментарии и не считайте это критической находкой без дополнительной проверки.</w:t>
       </w:r>
     </w:p>
     <w:p>

</xml_diff>

<commit_message>
Add note on available validators for custom PII patterns
Lists luhn, inn, snils, bank_account, ogrn, iban, vin_checksum, and
entropy_min (Shannon-entropy gate) as the validators available when
configuring a custom PII type.
</commit_message>
<xml_diff>
--- a/docs/analysis/case-03-instrukciya-proverka-maskirovaniya.docx
+++ b/docs/analysis/case-03-instrukciya-proverka-maskirovaniya.docx
@@ -1760,6 +1760,111 @@
       </w:pPr>
       <w:r>
         <w:t xml:space="preserve">Если видите утечку настоящих данных, перепутанные метки или постоянные ошибки/таймауты — зафиксируйте это в трекере с максимумом деталей (какой файл, какой формат, что именно увидели) и сообщите техническому контакту, не пытаясь диагностировать причину самостоятельно — это отдельная задача команды сопровождения.</w:t>
+      </w:r>
+    </w:p>
+    <w:p>
+      <w:pPr>
+        <w:pStyle w:val="Heading1"/>
+        <w:spacing w:after="140" w:before="280"/>
+      </w:pPr>
+      <w:r>
+        <w:t xml:space="preserve">Примечание: валидаторы для кастомных паттернов</w:t>
+      </w:r>
+    </w:p>
+    <w:p>
+      <w:pPr>
+        <w:spacing w:after="140"/>
+      </w:pPr>
+      <w:r>
+        <w:t xml:space="preserve">Если под конкретную задачу настраивается кастомный тип ПДн (например, для номера договора), совпадение по паттерну дополнительно проверяется валидатором — это снижает долю ложных срабатываний. Доступные валидаторы: </w:t>
+      </w:r>
+      <w:r>
+        <w:rPr>
+          <w:rFonts w:ascii="Consolas" w:cs="Consolas" w:eastAsia="Consolas" w:hAnsi="Consolas"/>
+          <w:sz w:val="20"/>
+          <w:szCs w:val="20"/>
+        </w:rPr>
+        <w:t xml:space="preserve">luhn</w:t>
+      </w:r>
+      <w:r>
+        <w:t xml:space="preserve"> (контрольная сумма Луна — банковские карты), </w:t>
+      </w:r>
+      <w:r>
+        <w:rPr>
+          <w:rFonts w:ascii="Consolas" w:cs="Consolas" w:eastAsia="Consolas" w:hAnsi="Consolas"/>
+          <w:sz w:val="20"/>
+          <w:szCs w:val="20"/>
+        </w:rPr>
+        <w:t xml:space="preserve">inn</w:t>
+      </w:r>
+      <w:r>
+        <w:t xml:space="preserve"> (контрольное число ИНН), </w:t>
+      </w:r>
+      <w:r>
+        <w:rPr>
+          <w:rFonts w:ascii="Consolas" w:cs="Consolas" w:eastAsia="Consolas" w:hAnsi="Consolas"/>
+          <w:sz w:val="20"/>
+          <w:szCs w:val="20"/>
+        </w:rPr>
+        <w:t xml:space="preserve">snils</w:t>
+      </w:r>
+      <w:r>
+        <w:t xml:space="preserve"> (контрольное число СНИЛС), </w:t>
+      </w:r>
+      <w:r>
+        <w:rPr>
+          <w:rFonts w:ascii="Consolas" w:cs="Consolas" w:eastAsia="Consolas" w:hAnsi="Consolas"/>
+          <w:sz w:val="20"/>
+          <w:szCs w:val="20"/>
+        </w:rPr>
+        <w:t xml:space="preserve">bank_account</w:t>
+      </w:r>
+      <w:r>
+        <w:t xml:space="preserve"> (контроль номера расчётного счёта РФ), </w:t>
+      </w:r>
+      <w:r>
+        <w:rPr>
+          <w:rFonts w:ascii="Consolas" w:cs="Consolas" w:eastAsia="Consolas" w:hAnsi="Consolas"/>
+          <w:sz w:val="20"/>
+          <w:szCs w:val="20"/>
+        </w:rPr>
+        <w:t xml:space="preserve">ogrn</w:t>
+      </w:r>
+      <w:r>
+        <w:t xml:space="preserve"> (контрольное число ОГРН/ОГРНИП), </w:t>
+      </w:r>
+      <w:r>
+        <w:rPr>
+          <w:rFonts w:ascii="Consolas" w:cs="Consolas" w:eastAsia="Consolas" w:hAnsi="Consolas"/>
+          <w:sz w:val="20"/>
+          <w:szCs w:val="20"/>
+        </w:rPr>
+        <w:t xml:space="preserve">iban</w:t>
+      </w:r>
+      <w:r>
+        <w:t xml:space="preserve"> (контрольная сумма IBAN), </w:t>
+      </w:r>
+      <w:r>
+        <w:rPr>
+          <w:rFonts w:ascii="Consolas" w:cs="Consolas" w:eastAsia="Consolas" w:hAnsi="Consolas"/>
+          <w:sz w:val="20"/>
+          <w:szCs w:val="20"/>
+        </w:rPr>
+        <w:t xml:space="preserve">vin_checksum</w:t>
+      </w:r>
+      <w:r>
+        <w:t xml:space="preserve"> (контрольная сумма VIN автомобиля), </w:t>
+      </w:r>
+      <w:r>
+        <w:rPr>
+          <w:rFonts w:ascii="Consolas" w:cs="Consolas" w:eastAsia="Consolas" w:hAnsi="Consolas"/>
+          <w:sz w:val="20"/>
+          <w:szCs w:val="20"/>
+        </w:rPr>
+        <w:t xml:space="preserve">entropy_min</w:t>
+      </w:r>
+      <w:r>
+        <w:t xml:space="preserve"> (гейт по минимальной энтропии Шеннона — отсекает строки, непохожие по структуре на случайный идентификатор, например обычные слова).</w:t>
       </w:r>
     </w:p>
     <w:sectPr>

</xml_diff>